<commit_message>
Export Milestone 1 PDFs from Word and fix heading layout
Co-Authored-By: Claude Opus 5.5 <noreply@anthropic.com>
</commit_message>
<xml_diff>
--- a/Milestone 1/Milestone 1.docx
+++ b/Milestone 1/Milestone 1.docx
@@ -1206,6 +1206,7 @@
     <w:p>
       <w:pPr>
         <w:pStyle w:val="Heading2"/>
+        <w:keepNext/>
       </w:pPr>
       <w:r>
         <w:t xml:space="preserve">1.3  Users</w:t>
@@ -1689,6 +1690,7 @@
     <w:p>
       <w:pPr>
         <w:pStyle w:val="Heading2"/>
+        <w:keepNext/>
       </w:pPr>
       <w:r>
         <w:t xml:space="preserve">1.4  Stakeholders</w:t>
@@ -2211,6 +2213,7 @@
     <w:p>
       <w:pPr>
         <w:pStyle w:val="Heading2"/>
+        <w:keepNext/>
       </w:pPr>
       <w:r>
         <w:t xml:space="preserve">2.1  Functional requirements</w:t>
@@ -4967,6 +4970,7 @@
     <w:p>
       <w:pPr>
         <w:pStyle w:val="Heading2"/>
+        <w:keepNext/>
       </w:pPr>
       <w:r>
         <w:t xml:space="preserve">2.2  Non-functional requirements</w:t>
@@ -6442,6 +6446,7 @@
     <w:p>
       <w:pPr>
         <w:pStyle w:val="Heading2"/>
+        <w:keepNext/>
       </w:pPr>
       <w:r>
         <w:t xml:space="preserve">3.1  Functional requirements in scope</w:t>
@@ -7230,6 +7235,7 @@
     <w:p>
       <w:pPr>
         <w:pStyle w:val="Heading2"/>
+        <w:keepNext/>
       </w:pPr>
       <w:r>
         <w:t xml:space="preserve">4.1  Use case descriptions</w:t>
@@ -16793,6 +16799,7 @@
     <w:p>
       <w:pPr>
         <w:pStyle w:val="Heading2"/>
+        <w:keepNext/>
       </w:pPr>
       <w:r>
         <w:t xml:space="preserve">2.4  Alternatives considered</w:t>
@@ -18270,6 +18277,7 @@
     <w:p>
       <w:pPr>
         <w:pStyle w:val="Heading3"/>
+        <w:keepNext/>
       </w:pPr>
       <w:r>
         <w:t xml:space="preserve">Layered architecture</w:t>
@@ -18489,6 +18497,7 @@
     <w:p>
       <w:pPr>
         <w:pStyle w:val="Heading3"/>
+        <w:keepNext/>
       </w:pPr>
       <w:r>
         <w:t xml:space="preserve">Model, View, ViewModel (MVVM)</w:t>
@@ -18732,6 +18741,7 @@
     <w:p>
       <w:pPr>
         <w:pStyle w:val="Heading3"/>
+        <w:keepNext/>
       </w:pPr>
       <w:r>
         <w:t xml:space="preserve">Strategy</w:t>
@@ -18966,6 +18976,7 @@
     <w:p>
       <w:pPr>
         <w:pStyle w:val="Heading3"/>
+        <w:keepNext/>
       </w:pPr>
       <w:r>
         <w:t xml:space="preserve">Chain of Responsibility</w:t>
@@ -19200,6 +19211,7 @@
     <w:p>
       <w:pPr>
         <w:pStyle w:val="Heading3"/>
+        <w:keepNext/>
       </w:pPr>
       <w:r>
         <w:t xml:space="preserve">Repository</w:t>
@@ -19464,6 +19476,7 @@
     <w:p>
       <w:pPr>
         <w:pStyle w:val="Heading3"/>
+        <w:keepNext/>
       </w:pPr>
       <w:r>
         <w:t xml:space="preserve">Adapter</w:t>
@@ -19766,6 +19779,7 @@
     <w:p>
       <w:pPr>
         <w:pStyle w:val="Heading3"/>
+        <w:keepNext/>
       </w:pPr>
       <w:r>
         <w:t xml:space="preserve">Dependency injection</w:t>
@@ -21563,6 +21577,7 @@
     <w:p>
       <w:pPr>
         <w:pStyle w:val="Heading2"/>
+        <w:keepNext/>
       </w:pPr>
       <w:r>
         <w:t xml:space="preserve">6.2  Risks</w:t>

</xml_diff>

<commit_message>
Add Milestone 1 presentation; align scope wording across documents
Co-Authored-By: Claude Opus 5.5 <noreply@anthropic.com>
</commit_message>
<xml_diff>
--- a/Milestone 1/Milestone 1.docx
+++ b/Milestone 1/Milestone 1.docx
@@ -513,7 +513,23 @@
                 <w:sz w:val="18"/>
                 <w:szCs w:val="18"/>
               </w:rPr>
-              <w:t xml:space="preserve">Slide-by-slide outline covering every topic the milestone asks the presentation to cover, with the figure to use on each slide.</w:t>
+              <w:t xml:space="preserve">A 17-slide deck for the 20-minute talk, with speaker notes, in Quickdress</w:t>
+            </w:r>
+            <w:r>
+              <w:rPr>
+                <w:i/>
+                <w:iCs/>
+                <w:sz w:val="18"/>
+                <w:szCs w:val="18"/>
+              </w:rPr>
+              <w:t xml:space="preserve">Milestone1</w:t>
+            </w:r>
+            <w:r>
+              <w:rPr>
+                <w:sz w:val="18"/>
+                <w:szCs w:val="18"/>
+              </w:rPr>
+              <w:t xml:space="preserve">Presentation.pptx (and PDF). Part C maps each required topic to its slide.</w:t>
             </w:r>
           </w:p>
         </w:tc>
@@ -542,7 +558,7 @@
                 <w:sz w:val="18"/>
                 <w:szCs w:val="18"/>
               </w:rPr>
-              <w:t xml:space="preserve">Part C</w:t>
+              <w:t xml:space="preserve">Separate file and Part C</w:t>
             </w:r>
           </w:p>
         </w:tc>
@@ -6440,7 +6456,7 @@
         <w:spacing w:after="140" w:line="288"/>
       </w:pPr>
       <w:r>
-        <w:t xml:space="preserve">The team will implement the 13 functional requirements FR-01 to FR-13 and the 8 non-functional requirements NFR-01 to NFR-08. FR-22 is attempted in Sprint 3 only if capacity remains after FR-12 and FR-13. Everything else in the backlog is deferred.</w:t>
+        <w:t xml:space="preserve">The team commits to the 11 functional requirements FR-01 to FR-11 and the 8 non-functional requirements NFR-01 to NFR-08. FR-12, FR-13 and FR-22 are stretch goals, built in Sprint 3 only if capacity remains. Everything else in the backlog is deferred.</w:t>
       </w:r>
     </w:p>
     <w:p>
@@ -7077,7 +7093,7 @@
           <wp:inline distT="0" distB="0" distL="0" distR="0">
             <wp:extent cx="5715000" cy="1981200"/>
             <wp:effectExtent t="0" r="0" b="0" l="0"/>
-            <wp:docPr id="7" name="sprints.png" descr="Figure 1. Sprint plan: three sprints, one per remaining milestone." title="Figure 1. Sprint plan: three sprints, one per remaining milestone."/>
+            <wp:docPr id="1" name="sprints.png" descr="Figure 1. Sprint plan: three sprints, one per remaining milestone." title="Figure 1. Sprint plan: three sprints, one per remaining milestone."/>
             <wp:cNvGraphicFramePr>
               <a:graphicFrameLocks xmlns:a="http://schemas.openxmlformats.org/drawingml/2006/main" noChangeAspect="1"/>
             </wp:cNvGraphicFramePr>
@@ -7172,7 +7188,7 @@
           <wp:inline distT="0" distB="0" distL="0" distR="0">
             <wp:extent cx="5715000" cy="4191000"/>
             <wp:effectExtent t="0" r="0" b="0" l="0"/>
-            <wp:docPr id="8" name="usecase.png" descr="Figure 2. Use case diagram: one primary actor, three secondary actors, twelve use cases." title="Figure 2. Use case diagram: one primary actor, three secondary actors, twelve use cases."/>
+            <wp:docPr id="2" name="usecase.png" descr="Figure 2. Use case diagram: one primary actor, three secondary actors, twelve use cases." title="Figure 2. Use case diagram: one primary actor, three secondary actors, twelve use cases."/>
             <wp:cNvGraphicFramePr>
               <a:graphicFrameLocks xmlns:a="http://schemas.openxmlformats.org/drawingml/2006/main" noChangeAspect="1"/>
             </wp:cNvGraphicFramePr>
@@ -10592,7 +10608,7 @@
         </w:sectPr>
       </w:pPr>
       <w:r>
-        <w:t xml:space="preserve">Quickdress solves a small but daily problem, choosing what to wear, by recommending one outfit from the user's own wardrobe, matched to the weather and the day's calendar. This document fixes the Milestone 1 baseline: a backlog of 22 functional and 11 non-functional requirements, a committed scope of FR-01 to FR-13 and NFR-01 to NFR-08 with FR-22 as a stretch goal, twelve use cases, and a three-sprint plan in which each sprint ends with a demonstrable app. The accompanying Design Specification shows how the MVVM and layered architecture, with the recommender behind a single interface, meets the non-functional requirements committed here. The next delivery is Sprint 1: a working digital wardrobe with capture, editing and browsing.</w:t>
+        <w:t xml:space="preserve">Quickdress solves a small but daily problem, choosing what to wear, by recommending one outfit from the user's own wardrobe, matched to the weather and the day's calendar. This document fixes the Milestone 1 baseline: a backlog of 22 functional and 11 non-functional requirements, a committed scope of FR-01 to FR-11 and NFR-01 to NFR-08 with FR-12, FR-13 and FR-22 as stretch goals, twelve use cases, and a three-sprint plan in which each sprint ends with a demonstrable app. The accompanying Design Specification shows how the MVVM and layered architecture, with the recommender behind a single interface, meets the non-functional requirements committed here. The next delivery is Sprint 1: a working digital wardrobe with capture, editing and browsing.</w:t>
       </w:r>
     </w:p>
     <w:p>
@@ -10924,7 +10940,7 @@
           <wp:inline distT="0" distB="0" distL="0" distR="0">
             <wp:extent cx="9382125" cy="5305425"/>
             <wp:effectExtent t="0" r="0" b="0" l="0"/>
-            <wp:docPr id="9" name="component.png" descr="Figure 1. UML component diagram of Quickdress. Colours match the class diagram in Figure 4." title="Figure 1. UML component diagram of Quickdress. Colours match the class diagram in Figure 4."/>
+            <wp:docPr id="3" name="component.png" descr="Figure 1. UML component diagram of Quickdress. Colours match the class diagram in Figure 4." title="Figure 1. UML component diagram of Quickdress. Colours match the class diagram in Figure 4."/>
             <wp:cNvGraphicFramePr>
               <a:graphicFrameLocks xmlns:a="http://schemas.openxmlformats.org/drawingml/2006/main" noChangeAspect="1"/>
             </wp:cNvGraphicFramePr>
@@ -15485,7 +15501,7 @@
           <wp:inline distT="0" distB="0" distL="0" distR="0">
             <wp:extent cx="8191500" cy="5429250"/>
             <wp:effectExtent t="0" r="0" b="0" l="0"/>
-            <wp:docPr id="10" name="seq_main.png" descr="Figure 2. Sequence diagram for the &quot;View today's outfit&quot; use case (FR-05, FR-08, FR-11, NFR-01). The recommender step is shown in Figure 3." title="Figure 2. Sequence diagram for the &quot;View today's outfit&quot; use case (FR-05, FR-08, FR-11, NFR-01). The recommender step is shown in Figure 3."/>
+            <wp:docPr id="4" name="seq_main.png" descr="Figure 2. Sequence diagram for the &quot;View today's outfit&quot; use case (FR-05, FR-08, FR-11, NFR-01). The recommender step is shown in Figure 3." title="Figure 2. Sequence diagram for the &quot;View today's outfit&quot; use case (FR-05, FR-08, FR-11, NFR-01). The recommender step is shown in Figure 3."/>
             <wp:cNvGraphicFramePr>
               <a:graphicFrameLocks xmlns:a="http://schemas.openxmlformats.org/drawingml/2006/main" noChangeAspect="1"/>
             </wp:cNvGraphicFramePr>
@@ -15953,7 +15969,7 @@
           <wp:inline distT="0" distB="0" distL="0" distR="0">
             <wp:extent cx="7620000" cy="5000625"/>
             <wp:effectExtent t="0" r="0" b="0" l="0"/>
-            <wp:docPr id="11" name="seq_chain.png" descr="Figure 3. Sequence diagram for &quot;Recommend outfit&quot;, the fallback chain referenced in Figure 2 (FR-05, FR-22, NFR-02, NFR-03, NFR-08)." title="Figure 3. Sequence diagram for &quot;Recommend outfit&quot;, the fallback chain referenced in Figure 2 (FR-05, FR-22, NFR-02, NFR-03, NFR-08)."/>
+            <wp:docPr id="5" name="seq_chain.png" descr="Figure 3. Sequence diagram for &quot;Recommend outfit&quot;, the fallback chain referenced in Figure 2 (FR-05, FR-22, NFR-02, NFR-03, NFR-08)." title="Figure 3. Sequence diagram for &quot;Recommend outfit&quot;, the fallback chain referenced in Figure 2 (FR-05, FR-22, NFR-02, NFR-03, NFR-08)."/>
             <wp:cNvGraphicFramePr>
               <a:graphicFrameLocks xmlns:a="http://schemas.openxmlformats.org/drawingml/2006/main" noChangeAspect="1"/>
             </wp:cNvGraphicFramePr>
@@ -20031,7 +20047,7 @@
           <wp:inline distT="0" distB="0" distL="0" distR="0">
             <wp:extent cx="6572250" cy="6467475"/>
             <wp:effectExtent t="0" r="0" b="0" l="0"/>
-            <wp:docPr id="12" name="class2.png" descr="Figure 4. UML class diagram (Swift types). The components in Figure 1 are made up of these classes." title="Figure 4. UML class diagram (Swift types). The components in Figure 1 are made up of these classes."/>
+            <wp:docPr id="6" name="class2.png" descr="Figure 4. UML class diagram (Swift types). The components in Figure 1 are made up of these classes." title="Figure 4. UML class diagram (Swift types). The components in Figure 1 are made up of these classes."/>
             <wp:cNvGraphicFramePr>
               <a:graphicFrameLocks xmlns:a="http://schemas.openxmlformats.org/drawingml/2006/main" noChangeAspect="1"/>
             </wp:cNvGraphicFramePr>
@@ -23384,7 +23400,17 @@
         <w:spacing w:after="140" w:line="288"/>
       </w:pPr>
       <w:r>
-        <w:t xml:space="preserve">The milestone asks the presentation to cover a fixed list of topics. Table C1 gives one slide per topic, the points to make, and where the material comes from.</w:t>
+        <w:t xml:space="preserve">The milestone asks the presentation to cover a fixed list of topics. The deck itself is the separate file Quickdress</w:t>
+      </w:r>
+      <w:r>
+        <w:rPr>
+          <w:i/>
+          <w:iCs/>
+        </w:rPr>
+        <w:t xml:space="preserve">Milestone1</w:t>
+      </w:r>
+      <w:r>
+        <w:t xml:space="preserve">Presentation.pptx. Table C1 shows where each required topic is covered, the points to make, and where the material comes from.</w:t>
       </w:r>
     </w:p>
     <w:tbl>
@@ -24212,7 +24238,7 @@
                 <w:sz w:val="18"/>
                 <w:szCs w:val="18"/>
               </w:rPr>
-              <w:t xml:space="preserve">FR-01 to FR-13 and NFR-01 to NFR-08 committed; FR-12, FR-13 and FR-22 are stretch goals; FR-14 to FR-21 deferred.</w:t>
+              <w:t xml:space="preserve">FR-01 to FR-11 and NFR-01 to NFR-08 committed; FR-12, FR-13 and FR-22 are stretch goals; FR-14 to FR-21 deferred.</w:t>
             </w:r>
           </w:p>
         </w:tc>

</xml_diff>